<commit_message>
Journal: log the wild-card allocation to-do
Alan raised for future consideration, not decided or scoped: a 5-10%
portfolio allocation to a rule-disregarding (or new-rule-governed)
sleeve for exceptional opportunities outside the current Landry
Strategy's Entry Checklist / Tier 1-3 gates. Logged to Journal (row
38) and added to the Process Recap's Open Items section so the just-
delivered doc doesn't go stale minutes after being sent.

Co-Authored-By: Claude Sonnet 5 <noreply@anthropic.com>
</commit_message>
<xml_diff>
--- a/docs/Landry System Process Recap.docx
+++ b/docs/Landry System Process Recap.docx
@@ -2091,6 +2091,25 @@
           <w:rFonts w:ascii="Calibri" w:hAnsi="Calibri"/>
           <w:b/>
         </w:rPr>
+        <w:t xml:space="preserve">“Wild card” allocation — </w:t>
+      </w:r>
+      <w:r>
+        <w:rPr>
+          <w:rFonts w:ascii="Calibri" w:hAnsi="Calibri"/>
+        </w:rPr>
+        <w:t>raised 9/11/26 for future consideration, not decided or scoped: a 5-10% portfolio allocation to a rule-disregarding (or new-rule-governed) sleeve for exceptional opportunities outside the current Landry Strategy's normal Entry Checklist / Tier 1-3 gates. Genuinely undefined at this stage — what counts as “exceptional,” how it would be sized/tracked separately, whether it needs its own sell discipline, and how it interacts with Part 5's position/sector caps and Part 7's drawdown response.</w:t>
+      </w:r>
+    </w:p>
+    <w:p>
+      <w:pPr>
+        <w:pStyle w:val="ListBullet"/>
+        <w:spacing w:after="80"/>
+      </w:pPr>
+      <w:r>
+        <w:rPr>
+          <w:rFonts w:ascii="Calibri" w:hAnsi="Calibri"/>
+          <w:b/>
+        </w:rPr>
         <w:t xml:space="preserve">Database migration — </w:t>
       </w:r>
       <w:r>

</xml_diff>